<commit_message>
Cập nhật tính năng mới
</commit_message>
<xml_diff>
--- a/README.docx
+++ b/README.docx
@@ -2647,6 +2647,244 @@
           <w14:ligatures w14:val="none"/>
         </w:rPr>
         <w:t xml:space="preserve">: Xóa tin nhắn đối với cả hai bên. </w:t>
+      </w:r>
+    </w:p>
+    <w:p>
+      <w:pPr>
+        <w:pStyle w:val="ListParagraph"/>
+        <w:numPr>
+          <w:ilvl w:val="0"/>
+          <w:numId w:val="6"/>
+        </w:numPr>
+        <w:spacing w:before="100" w:beforeAutospacing="1" w:after="100" w:afterAutospacing="1" w:line="240" w:lineRule="auto"/>
+        <w:outlineLvl w:val="2"/>
+        <w:rPr>
+          <w:rFonts w:ascii="Times New Roman" w:eastAsia="Times New Roman" w:hAnsi="Times New Roman" w:cs="Times New Roman"/>
+          <w:b/>
+          <w:bCs/>
+          <w:kern w:val="0"/>
+          <w:sz w:val="27"/>
+          <w:szCs w:val="27"/>
+          <w:lang w:val="en-US"/>
+          <w14:ligatures w14:val="none"/>
+        </w:rPr>
+      </w:pPr>
+      <w:r>
+        <w:rPr>
+          <w:rFonts w:ascii="Times New Roman" w:eastAsia="Times New Roman" w:hAnsi="Times New Roman" w:cs="Times New Roman"/>
+          <w:b/>
+          <w:bCs/>
+          <w:kern w:val="0"/>
+          <w:sz w:val="27"/>
+          <w:szCs w:val="27"/>
+          <w:lang w:val="en-US"/>
+          <w14:ligatures w14:val="none"/>
+        </w:rPr>
+        <w:t>Quy trình Cập nhật Code sau này (Nếu có nâng cấp)</w:t>
+      </w:r>
+    </w:p>
+    <w:p>
+      <w:pPr>
+        <w:pStyle w:val="ListParagraph"/>
+        <w:numPr>
+          <w:ilvl w:val="0"/>
+          <w:numId w:val="6"/>
+        </w:numPr>
+        <w:spacing w:before="100" w:beforeAutospacing="1" w:after="100" w:afterAutospacing="1" w:line="240" w:lineRule="auto"/>
+        <w:rPr>
+          <w:rFonts w:ascii="Times New Roman" w:eastAsia="Times New Roman" w:hAnsi="Times New Roman" w:cs="Times New Roman"/>
+          <w:kern w:val="0"/>
+          <w:lang w:val="en-US"/>
+          <w14:ligatures w14:val="none"/>
+        </w:rPr>
+      </w:pPr>
+      <w:r>
+        <w:rPr>
+          <w:rFonts w:ascii="Times New Roman" w:eastAsia="Times New Roman" w:hAnsi="Times New Roman" w:cs="Times New Roman"/>
+          <w:kern w:val="0"/>
+          <w:lang w:val="en-US"/>
+          <w14:ligatures w14:val="none"/>
+        </w:rPr>
+        <w:t>Sau này nếu bạn sửa code ở máy local (ví dụ: đổi giao diện, thêm tính năng mới), bạn không cần tạo lại service trên Render. Bạn chỉ cần mở Terminal trong VS Code và chạy 3 lệnh Git:</w:t>
+      </w:r>
+    </w:p>
+    <w:p>
+      <w:pPr>
+        <w:pStyle w:val="ListParagraph"/>
+        <w:numPr>
+          <w:ilvl w:val="0"/>
+          <w:numId w:val="6"/>
+        </w:numPr>
+        <w:spacing w:after="0" w:line="240" w:lineRule="auto"/>
+        <w:rPr>
+          <w:rFonts w:ascii="Times New Roman" w:eastAsia="Times New Roman" w:hAnsi="Times New Roman" w:cs="Times New Roman"/>
+          <w:kern w:val="0"/>
+          <w:lang w:val="en-US"/>
+          <w14:ligatures w14:val="none"/>
+        </w:rPr>
+      </w:pPr>
+      <w:r>
+        <w:rPr>
+          <w:rFonts w:ascii="Times New Roman" w:eastAsia="Times New Roman" w:hAnsi="Times New Roman" w:cs="Times New Roman"/>
+          <w:kern w:val="0"/>
+          <w:lang w:val="en-US"/>
+          <w14:ligatures w14:val="none"/>
+        </w:rPr>
+        <w:t>Bash</w:t>
+      </w:r>
+    </w:p>
+    <w:p>
+      <w:pPr>
+        <w:pStyle w:val="ListParagraph"/>
+        <w:numPr>
+          <w:ilvl w:val="0"/>
+          <w:numId w:val="6"/>
+        </w:numPr>
+        <w:tabs>
+          <w:tab w:val="left" w:pos="916"/>
+          <w:tab w:val="left" w:pos="1832"/>
+          <w:tab w:val="left" w:pos="2748"/>
+          <w:tab w:val="left" w:pos="3664"/>
+          <w:tab w:val="left" w:pos="4580"/>
+          <w:tab w:val="left" w:pos="5496"/>
+          <w:tab w:val="left" w:pos="6412"/>
+          <w:tab w:val="left" w:pos="7328"/>
+          <w:tab w:val="left" w:pos="8244"/>
+          <w:tab w:val="left" w:pos="9160"/>
+          <w:tab w:val="left" w:pos="10076"/>
+          <w:tab w:val="left" w:pos="10992"/>
+          <w:tab w:val="left" w:pos="11908"/>
+          <w:tab w:val="left" w:pos="12824"/>
+          <w:tab w:val="left" w:pos="13740"/>
+          <w:tab w:val="left" w:pos="14656"/>
+        </w:tabs>
+        <w:spacing w:after="0" w:line="240" w:lineRule="auto"/>
+        <w:rPr>
+          <w:rFonts w:ascii="Courier New" w:eastAsia="Times New Roman" w:hAnsi="Courier New" w:cs="Courier New"/>
+          <w:kern w:val="0"/>
+          <w:sz w:val="20"/>
+          <w:szCs w:val="20"/>
+          <w:lang w:val="en-US"/>
+          <w14:ligatures w14:val="none"/>
+        </w:rPr>
+      </w:pPr>
+      <w:r>
+        <w:rPr>
+          <w:rFonts w:ascii="Courier New" w:eastAsia="Times New Roman" w:hAnsi="Courier New" w:cs="Courier New"/>
+          <w:kern w:val="0"/>
+          <w:sz w:val="20"/>
+          <w:szCs w:val="20"/>
+          <w:lang w:val="en-US"/>
+          <w14:ligatures w14:val="none"/>
+        </w:rPr>
+        <w:t xml:space="preserve">git </w:t>
+      </w:r>
+      <w:proofErr w:type="gramStart"/>
+      <w:r>
+        <w:rPr>
+          <w:rFonts w:ascii="Courier New" w:eastAsia="Times New Roman" w:hAnsi="Courier New" w:cs="Courier New"/>
+          <w:kern w:val="0"/>
+          <w:sz w:val="20"/>
+          <w:szCs w:val="20"/>
+          <w:lang w:val="en-US"/>
+          <w14:ligatures w14:val="none"/>
+        </w:rPr>
+        <w:t>add .</w:t>
+      </w:r>
+      <w:proofErr w:type="gramEnd"/>
+    </w:p>
+    <w:p>
+      <w:pPr>
+        <w:pStyle w:val="ListParagraph"/>
+        <w:numPr>
+          <w:ilvl w:val="0"/>
+          <w:numId w:val="6"/>
+        </w:numPr>
+        <w:tabs>
+          <w:tab w:val="left" w:pos="916"/>
+          <w:tab w:val="left" w:pos="1832"/>
+          <w:tab w:val="left" w:pos="2748"/>
+          <w:tab w:val="left" w:pos="3664"/>
+          <w:tab w:val="left" w:pos="4580"/>
+          <w:tab w:val="left" w:pos="5496"/>
+          <w:tab w:val="left" w:pos="6412"/>
+          <w:tab w:val="left" w:pos="7328"/>
+          <w:tab w:val="left" w:pos="8244"/>
+          <w:tab w:val="left" w:pos="9160"/>
+          <w:tab w:val="left" w:pos="10076"/>
+          <w:tab w:val="left" w:pos="10992"/>
+          <w:tab w:val="left" w:pos="11908"/>
+          <w:tab w:val="left" w:pos="12824"/>
+          <w:tab w:val="left" w:pos="13740"/>
+          <w:tab w:val="left" w:pos="14656"/>
+        </w:tabs>
+        <w:spacing w:after="0" w:line="240" w:lineRule="auto"/>
+        <w:rPr>
+          <w:rFonts w:ascii="Courier New" w:eastAsia="Times New Roman" w:hAnsi="Courier New" w:cs="Courier New"/>
+          <w:kern w:val="0"/>
+          <w:sz w:val="20"/>
+          <w:szCs w:val="20"/>
+          <w:lang w:val="en-US"/>
+          <w14:ligatures w14:val="none"/>
+        </w:rPr>
+      </w:pPr>
+      <w:r>
+        <w:rPr>
+          <w:rFonts w:ascii="Courier New" w:eastAsia="Times New Roman" w:hAnsi="Courier New" w:cs="Courier New"/>
+          <w:kern w:val="0"/>
+          <w:sz w:val="20"/>
+          <w:szCs w:val="20"/>
+          <w:lang w:val="en-US"/>
+          <w14:ligatures w14:val="none"/>
+        </w:rPr>
+        <w:t>git commit -m "Cập nhật tính năng mới"</w:t>
+      </w:r>
+    </w:p>
+    <w:p>
+      <w:pPr>
+        <w:pStyle w:val="ListParagraph"/>
+        <w:numPr>
+          <w:ilvl w:val="0"/>
+          <w:numId w:val="6"/>
+        </w:numPr>
+        <w:tabs>
+          <w:tab w:val="left" w:pos="916"/>
+          <w:tab w:val="left" w:pos="1832"/>
+          <w:tab w:val="left" w:pos="2748"/>
+          <w:tab w:val="left" w:pos="3664"/>
+          <w:tab w:val="left" w:pos="4580"/>
+          <w:tab w:val="left" w:pos="5496"/>
+          <w:tab w:val="left" w:pos="6412"/>
+          <w:tab w:val="left" w:pos="7328"/>
+          <w:tab w:val="left" w:pos="8244"/>
+          <w:tab w:val="left" w:pos="9160"/>
+          <w:tab w:val="left" w:pos="10076"/>
+          <w:tab w:val="left" w:pos="10992"/>
+          <w:tab w:val="left" w:pos="11908"/>
+          <w:tab w:val="left" w:pos="12824"/>
+          <w:tab w:val="left" w:pos="13740"/>
+          <w:tab w:val="left" w:pos="14656"/>
+        </w:tabs>
+        <w:spacing w:after="0" w:line="240" w:lineRule="auto"/>
+        <w:rPr>
+          <w:rFonts w:ascii="Courier New" w:eastAsia="Times New Roman" w:hAnsi="Courier New" w:cs="Courier New"/>
+          <w:kern w:val="0"/>
+          <w:sz w:val="20"/>
+          <w:szCs w:val="20"/>
+          <w:lang w:val="en-US"/>
+          <w14:ligatures w14:val="none"/>
+        </w:rPr>
+      </w:pPr>
+      <w:r>
+        <w:rPr>
+          <w:rFonts w:ascii="Courier New" w:eastAsia="Times New Roman" w:hAnsi="Courier New" w:cs="Courier New"/>
+          <w:kern w:val="0"/>
+          <w:sz w:val="20"/>
+          <w:szCs w:val="20"/>
+          <w:lang w:val="en-US"/>
+          <w14:ligatures w14:val="none"/>
+        </w:rPr>
+        <w:t>git push</w:t>
       </w:r>
     </w:p>
     <w:p/>
@@ -3999,7 +4237,6 @@
     <w:next w:val="Normal"/>
     <w:link w:val="Heading3Char"/>
     <w:uiPriority w:val="9"/>
-    <w:semiHidden/>
     <w:unhideWhenUsed/>
     <w:qFormat/>
     <w:rsid w:val="003E049C"/>
@@ -4207,7 +4444,6 @@
     <w:basedOn w:val="DefaultParagraphFont"/>
     <w:link w:val="Heading3"/>
     <w:uiPriority w:val="9"/>
-    <w:semiHidden/>
     <w:rsid w:val="003E049C"/>
     <w:rPr>
       <w:rFonts w:eastAsiaTheme="majorEastAsia" w:cstheme="majorBidi"/>
@@ -4464,6 +4700,99 @@
       <w:color w:val="2F5496" w:themeColor="accent1" w:themeShade="BF"/>
       <w:spacing w:val="5"/>
     </w:rPr>
+  </w:style>
+  <w:style w:type="paragraph" w:styleId="NormalWeb">
+    <w:name w:val="Normal (Web)"/>
+    <w:basedOn w:val="Normal"/>
+    <w:uiPriority w:val="99"/>
+    <w:semiHidden/>
+    <w:unhideWhenUsed/>
+    <w:rsid w:val="00FF6130"/>
+    <w:pPr>
+      <w:spacing w:before="100" w:beforeAutospacing="1" w:after="100" w:afterAutospacing="1" w:line="240" w:lineRule="auto"/>
+    </w:pPr>
+    <w:rPr>
+      <w:rFonts w:ascii="Times New Roman" w:eastAsia="Times New Roman" w:hAnsi="Times New Roman" w:cs="Times New Roman"/>
+      <w:kern w:val="0"/>
+      <w:lang w:val="en-US"/>
+      <w14:ligatures w14:val="none"/>
+    </w:rPr>
+  </w:style>
+  <w:style w:type="character" w:customStyle="1" w:styleId="ng-tns-c2481097683-263">
+    <w:name w:val="ng-tns-c2481097683-263"/>
+    <w:basedOn w:val="DefaultParagraphFont"/>
+    <w:rsid w:val="00FF6130"/>
+  </w:style>
+  <w:style w:type="paragraph" w:styleId="HTMLPreformatted">
+    <w:name w:val="HTML Preformatted"/>
+    <w:basedOn w:val="Normal"/>
+    <w:link w:val="HTMLPreformattedChar"/>
+    <w:uiPriority w:val="99"/>
+    <w:semiHidden/>
+    <w:unhideWhenUsed/>
+    <w:rsid w:val="00FF6130"/>
+    <w:pPr>
+      <w:tabs>
+        <w:tab w:val="left" w:pos="916"/>
+        <w:tab w:val="left" w:pos="1832"/>
+        <w:tab w:val="left" w:pos="2748"/>
+        <w:tab w:val="left" w:pos="3664"/>
+        <w:tab w:val="left" w:pos="4580"/>
+        <w:tab w:val="left" w:pos="5496"/>
+        <w:tab w:val="left" w:pos="6412"/>
+        <w:tab w:val="left" w:pos="7328"/>
+        <w:tab w:val="left" w:pos="8244"/>
+        <w:tab w:val="left" w:pos="9160"/>
+        <w:tab w:val="left" w:pos="10076"/>
+        <w:tab w:val="left" w:pos="10992"/>
+        <w:tab w:val="left" w:pos="11908"/>
+        <w:tab w:val="left" w:pos="12824"/>
+        <w:tab w:val="left" w:pos="13740"/>
+        <w:tab w:val="left" w:pos="14656"/>
+      </w:tabs>
+      <w:spacing w:after="0" w:line="240" w:lineRule="auto"/>
+    </w:pPr>
+    <w:rPr>
+      <w:rFonts w:ascii="Courier New" w:eastAsia="Times New Roman" w:hAnsi="Courier New" w:cs="Courier New"/>
+      <w:kern w:val="0"/>
+      <w:sz w:val="20"/>
+      <w:szCs w:val="20"/>
+      <w:lang w:val="en-US"/>
+      <w14:ligatures w14:val="none"/>
+    </w:rPr>
+  </w:style>
+  <w:style w:type="character" w:customStyle="1" w:styleId="HTMLPreformattedChar">
+    <w:name w:val="HTML Preformatted Char"/>
+    <w:basedOn w:val="DefaultParagraphFont"/>
+    <w:link w:val="HTMLPreformatted"/>
+    <w:uiPriority w:val="99"/>
+    <w:semiHidden/>
+    <w:rsid w:val="00FF6130"/>
+    <w:rPr>
+      <w:rFonts w:ascii="Courier New" w:eastAsia="Times New Roman" w:hAnsi="Courier New" w:cs="Courier New"/>
+      <w:kern w:val="0"/>
+      <w:sz w:val="20"/>
+      <w:szCs w:val="20"/>
+      <w14:ligatures w14:val="none"/>
+    </w:rPr>
+  </w:style>
+  <w:style w:type="character" w:styleId="HTMLCode">
+    <w:name w:val="HTML Code"/>
+    <w:basedOn w:val="DefaultParagraphFont"/>
+    <w:uiPriority w:val="99"/>
+    <w:semiHidden/>
+    <w:unhideWhenUsed/>
+    <w:rsid w:val="00FF6130"/>
+    <w:rPr>
+      <w:rFonts w:ascii="Courier New" w:eastAsia="Times New Roman" w:hAnsi="Courier New" w:cs="Courier New"/>
+      <w:sz w:val="20"/>
+      <w:szCs w:val="20"/>
+    </w:rPr>
+  </w:style>
+  <w:style w:type="character" w:customStyle="1" w:styleId="hljs-string">
+    <w:name w:val="hljs-string"/>
+    <w:basedOn w:val="DefaultParagraphFont"/>
+    <w:rsid w:val="00FF6130"/>
   </w:style>
 </w:styles>
 </file>

</xml_diff>